<commit_message>
Documentation tidy-up for domestic prices; Excel-AI 0.9.1 rebuilt
Domestic prices are held for Egypt only, as in the public legacy file; the documentation, notes,
interface manifest, CAVEATS entries and the 0.9.1 version log say so in neutral terms, and the
unused price extraction is removed from extract_data.py. Excel-AI 0.9.1 rebuilt (quick check
PASS, 15,082 output codes, 0 change); permalink copies refreshed; Word copies regenerated.

Co-Authored-By: Claude Opus 5.5 <noreply@anthropic.com>
Claude-Session: https://claude.ai/code/session_01VSHkeG2g7jKJXypZEVGQ8n
</commit_message>
<xml_diff>
--- a/coded/cpat_documentation/project/Spec.docx
+++ b/coded/cpat_documentation/project/Spec.docx
@@ -7436,7 +7436,22 @@
                 <w:bCs/>
                 <w:b/>
               </w:rPr>
-              <w:t xml:space="preserve">structure, augmented by the input files</w:t>
+              <w:t xml:space="preserve">structure, augmented by the input files; Coded CPAT reads tidy CSV (</w:t>
+            </w:r>
+            <w:r>
+              <w:rPr>
+                <w:rStyle w:val="VerbatimChar"/>
+                <w:bCs/>
+                <w:b/>
+              </w:rPr>
+              <w:t xml:space="preserve">data/tidy/</w:t>
+            </w:r>
+            <w:r>
+              <w:rPr>
+                <w:bCs/>
+                <w:b/>
+              </w:rPr>
+              <w:t xml:space="preserve">), with two-way converters to and from the legacy layout Excel-AI reads (user 2026-10-29)</w:t>
             </w:r>
             <w:r>
               <w:t xml:space="preserve">; document the code interface (the tables, columns and keys the model reads, not a user interface) for the data person. Databases:</w:t>

</xml_diff>

<commit_message>
Coded CPAT phase 6.1 and 6.4: run_model.py command line; Coded CPAT tab of the website; documentation updated
run_model.py runs a scenario-set file and writes results by country (CSV, optional
workbook). A third Quarto book, generated from coded/, is the website's Coded CPAT
tab. README, developer guide, spec status, CPAT-AI chapter 13 and the Word copies
updated to the new structure.

Co-Authored-By: Claude Opus 5.5 <noreply@anthropic.com>
Claude-Session: https://claude.ai/code/session_01VSHkeG2g7jKJXypZEVGQ8n
</commit_message>
<xml_diff>
--- a/coded/cpat_documentation/project/Spec.docx
+++ b/coded/cpat_documentation/project/Spec.docx
@@ -127,13 +127,25 @@
           <w:bCs/>
           <w:b/>
         </w:rPr>
-        <w:t xml:space="preserve">Status.</w:t>
-      </w:r>
-      <w:r>
-        <w:t xml:space="preserve"> </w:t>
-      </w:r>
-      <w:r>
-        <w:t xml:space="preserve">Planning done (phases 0 and 1 of the plan, 2026-10-29): the design choices of section 10 are decided and</w:t>
+        <w:t xml:space="preserve">Status (2026-10-29).</w:t>
+      </w:r>
+      <w:r>
+        <w:t xml:space="preserve"> </w:t>
+      </w:r>
+      <w:r>
+        <w:t xml:space="preserve">Phases 0-4 done and phase 5.4 (speed): the mitigation and distribution modules match Excel-AI’s stored values for Egypt, scenarios 1 and 2 (every output code, within 1e-9); phase 6 (running the model: command line, app, website, first release</w:t>
+      </w:r>
+      <w:r>
+        <w:t xml:space="preserve"> </w:t>
+      </w:r>
+      <w:r>
+        <w:rPr>
+          <w:rStyle w:val="VerbatimChar"/>
+        </w:rPr>
+        <w:t xml:space="preserve">0.9.1p0.1</w:t>
+      </w:r>
+      <w:r>
+        <w:t xml:space="preserve">) under way; phases 5.1-5.3 (systematic comparisons) next. The design choices of section 10 are decided and</w:t>
       </w:r>
       <w:r>
         <w:t xml:space="preserve"> </w:t>
@@ -148,7 +160,19 @@
         <w:t xml:space="preserve"> </w:t>
       </w:r>
       <w:r>
-        <w:t xml:space="preserve">states the rules that follow; section 11 is the detailed plan. Companion documents: the equation list (</w:t>
+        <w:t xml:space="preserve">states the rules that follow; section 11 is the detailed plan, its checklist</w:t>
+      </w:r>
+      <w:r>
+        <w:t xml:space="preserve"> </w:t>
+      </w:r>
+      <w:r>
+        <w:rPr>
+          <w:rStyle w:val="VerbatimChar"/>
+        </w:rPr>
+        <w:t xml:space="preserve">coded/TODO.md</w:t>
+      </w:r>
+      <w:r>
+        <w:t xml:space="preserve">. Companion documents: the equation list (</w:t>
       </w:r>
       <w:hyperlink r:id="rId20">
         <w:r>

</xml_diff>

<commit_message>
Coded CPAT phase 6.2, 6.3, 6.5: Shiny app on cpat_model.run; old code retired; release 0.9.1p0.1
The app builds its scenarios over Excel-AI's carbon-tax column and reads Results
(raw results, indicators, graphs incl. distribution); reruns compute only changed
scenarios. The earlier distribution package, distribution_inputs.py, constants.py
and config.py are retired. CHANGELOG.md; documentation and website books updated.

Co-Authored-By: Claude Opus 5.5 <noreply@anthropic.com>
Claude-Session: https://claude.ai/code/session_01VSHkeG2g7jKJXypZEVGQ8n
</commit_message>
<xml_diff>
--- a/coded/cpat_documentation/project/Spec.docx
+++ b/coded/cpat_documentation/project/Spec.docx
@@ -133,7 +133,7 @@
         <w:t xml:space="preserve"> </w:t>
       </w:r>
       <w:r>
-        <w:t xml:space="preserve">Phases 0-4 done and phase 5.4 (speed): the mitigation and distribution modules match Excel-AI’s stored values for Egypt, scenarios 1 and 2 (every output code, within 1e-9); phase 6 (running the model: command line, app, website, first release</w:t>
+        <w:t xml:space="preserve">Phases 0-4 done and phase 5.4 (speed): the mitigation and distribution modules match Excel-AI’s stored values for Egypt, scenarios 1 and 2 (every output code, within 1e-9); phase 6 done (command line, app, website, first release</w:t>
       </w:r>
       <w:r>
         <w:t xml:space="preserve"> </w:t>
@@ -145,7 +145,7 @@
         <w:t xml:space="preserve">0.9.1p0.1</w:t>
       </w:r>
       <w:r>
-        <w:t xml:space="preserve">) under way; phases 5.1-5.3 (systematic comparisons) next. The design choices of section 10 are decided and</w:t>
+        <w:t xml:space="preserve">); phases 5.0-5.3 (systematic comparisons) next. The design choices of section 10 are decided and</w:t>
       </w:r>
       <w:r>
         <w:t xml:space="preserve"> </w:t>

</xml_diff>